<commit_message>
Flag single-replicate false-positive edge case found while double-checking the biomarker
</commit_message>
<xml_diff>
--- a/qtwin/docs/Biochemical_Guardrails.docx
+++ b/qtwin/docs/Biochemical_Guardrails.docx
@@ -773,6 +773,30 @@
       </w:r>
       <w:r>
         <w:t xml:space="preserve">the concentration-dependence claim in the last sentence is a hypothesis based on the crowding model in Section 2, not yet directly verified against this dataset's biomarker column (qtwin/data/chip_summary.csv, binding_rate_probe_dfdt_30s) broken out by concentration group — worth a quick check before this goes in the proposal.</w:t>
+      </w:r>
+    </w:p>
+    <w:p>
+      <w:pPr>
+        <w:spacing w:after="120"/>
+      </w:pPr>
+      <w:r>
+        <w:t xml:space="preserve">Known limitation: chip 21Mar_No.29, a true negative control, has the second-fastest early binding rate in the whole dataset (-0.071 Hz/s) despite a near-zero full-run Δf (correctly FAILURE). This comes from one noisy replicate declining smoothly for 30s while the other replicate is flat with a step artifact — i.e. a single-replicate false positive on the early-window biomarker alone.</w:t>
+      </w:r>
+    </w:p>
+    <w:p>
+      <w:pPr>
+        <w:spacing w:after="150"/>
+      </w:pPr>
+      <w:r>
+        <w:rPr>
+          <w:b/>
+          <w:bCs/>
+          <w:color w:val="B00020"/>
+        </w:rPr>
+        <w:t xml:space="preserve">DRAFT — needs Eva's review: </w:t>
+      </w:r>
+      <w:r>
+        <w:t xml:space="preserve">should Week 2's models require agreement across replicates before trusting the 30s biomarker, rather than the simple per-chip average used here? See clarifying_questions.md item 7.</w:t>
       </w:r>
     </w:p>
     <w:p>

</xml_diff>

<commit_message>
Add biomarker purpose statement and correct displacement range in Section 5
Two things that were genuinely missing from the doc (not previously
written anywhere, despite earlier chat discussion referencing them):

- Purpose statement for the kinetic biomarker: rapid QC on the probe
  stage, not a crowding-avoidance mechanism -- crowding is a
  concentration-dependent effect (Section 2a/2b), the biomarker never
  touches concentration or the target stage.

- The real range of early_displacement_30s across all 44 valid chips:
  -374.63 Hz to +107.93 Hz (20Mar_No.5 low, 15Mar_No.21 high) added to
  Section 5(c), replacing an incorrect -0.6 to +0.9 Hz figure that
  never actually appeared anywhere in this doc -- traced to eyeballing
  only the two chips closest to zero (21Mar_No.8, 21Mar_No.7) instead
  of the full column.

Co-Authored-By: Claude Sonnet 5 <noreply@anthropic.com>
</commit_message>
<xml_diff>
--- a/qtwin/docs/Biochemical_Guardrails.docx
+++ b/qtwin/docs/Biochemical_Guardrails.docx
@@ -746,6 +746,14 @@
     </w:p>
     <w:p>
       <w:pPr>
+        <w:spacing w:after="120"/>
+      </w:pPr>
+      <w:r>
+        <w:t xml:space="preserve">Purpose: rapid QC on the probe-immobilization stage -- an early (30s, vs. waiting out the full ~150-220s run) read on whether a chip's probe binding is succeeding, computed entirely from probe-stage data. This is NOT a crowding-avoidance mechanism -- crowding is a concentration-dependent effect on the probe stage's own equilibrium magnitude (Section 2a) and a separate curve on the target stage (Section 2b); the biomarker doesn't touch concentration or the target stage at all. Conflating the two was an earlier framing error -- corrected here.</w:t>
+      </w:r>
+    </w:p>
+    <w:p>
+      <w:pPr>
         <w:pStyle w:val="Heading2"/>
         <w:spacing w:after="120" w:before="250"/>
       </w:pPr>
@@ -801,6 +809,14 @@
       </w:pPr>
       <w:r>
         <w:t xml:space="preserve">Correlation between early_displacement_30s and the corrected delta_f_probe is 0.9997 across the 44 valid chips — this is essentially an early readout of the same signal, which is exactly why it works as a feature (unlike the slope version, which was a genuinely different quantity). Simple threshold classification (predict SUCCESS if displacement &lt; 0) scores 97.5% (39/40 scoreable chips) at the 30s window in this implementation, and holds flat at 97.5% across 15s/30s/45s/60s windows too.</w:t>
+      </w:r>
+    </w:p>
+    <w:p>
+      <w:pPr>
+        <w:spacing w:after="120"/>
+      </w:pPr>
+      <w:r>
+        <w:t xml:space="preserve">Real range of early_displacement_30s across all 44 valid chips: -374.63 Hz to +107.93 Hz (20Mar_No.5 = -374.63 at the low end, 15Mar_No.21 = +107.93 at the high end). That width is the point -- a sub-1-Hz range couldn't support 97%+ classification accuracy; the threshold rule only works because real chips spread out this widely. (An earlier, much narrower -0.6 to +0.9 Hz figure was checked and traced to eyeballing only the two chips closest to zero -- 21Mar_No.8 at -0.04 and 21Mar_No.7 at +0.64 -- instead of the full 44-chip column; corrected here.)</w:t>
       </w:r>
     </w:p>
     <w:p>

</xml_diff>